<commit_message>
Polish v2.1 docs, UI, and demo setup
Add setup, API, architecture, and demo guides with page screenshots; improve dashboard layout and lab-file figures; update the Windows demo launcher to install ML dependencies and create an admin account on first run. Correct seed counts and remove obsolete starter files.
</commit_message>
<xml_diff>
--- a/docs/lab-file/SE_Lab_File_Credit_Card_Fraud_Detection_updated.docx
+++ b/docs/lab-file/SE_Lab_File_Credit_Card_Fraud_Detection_updated.docx
@@ -33866,6 +33866,63 @@
     </w:p>
     <w:p>
       <w:pPr>
+        <w:keepNext/>
+        <w:spacing w:after="80"/>
+        <w:jc w:val="center"/>
+      </w:pPr>
+      <w:r>
+        <w:drawing>
+          <wp:inline xmlns:a="http://schemas.openxmlformats.org/drawingml/2006/main" xmlns:pic="http://schemas.openxmlformats.org/drawingml/2006/picture">
+            <wp:extent cx="5400000" cy="2040000"/>
+            <wp:docPr id="5" name="Picture 5"/>
+            <wp:cNvGraphicFramePr>
+              <a:graphicFrameLocks noChangeAspect="1"/>
+            </wp:cNvGraphicFramePr>
+            <a:graphic>
+              <a:graphicData uri="http://schemas.openxmlformats.org/drawingml/2006/picture">
+                <pic:pic>
+                  <pic:nvPicPr>
+                    <pic:cNvPr id="0" name="fig_12_1_fp.png"/>
+                    <pic:cNvPicPr/>
+                  </pic:nvPicPr>
+                  <pic:blipFill>
+                    <a:blip r:embed="rId31"/>
+                    <a:stretch>
+                      <a:fillRect/>
+                    </a:stretch>
+                  </pic:blipFill>
+                  <pic:spPr>
+                    <a:xfrm>
+                      <a:off x="0" y="0"/>
+                      <a:ext cx="5400000" cy="2040000"/>
+                    </a:xfrm>
+                    <a:prstGeom prst="rect"/>
+                  </pic:spPr>
+                </pic:pic>
+              </a:graphicData>
+            </a:graphic>
+          </wp:inline>
+        </w:drawing>
+      </w:r>
+    </w:p>
+    <w:p>
+      <w:pPr>
+        <w:spacing w:after="160"/>
+        <w:jc w:val="center"/>
+      </w:pPr>
+      <w:r>
+        <w:rPr>
+          <w:rFonts w:ascii="Times New Roman" w:cs="Times New Roman" w:eastAsia="Times New Roman" w:hAnsi="Times New Roman"/>
+          <w:i/>
+          <w:iCs/>
+          <w:sz w:val="21"/>
+          <w:szCs w:val="21"/>
+        </w:rPr>
+        <w:t xml:space="preserve">Fig. 12.1: Unadjusted function points by function type, and FP-based versus COCOMO effort</w:t>
+      </w:r>
+    </w:p>
+    <w:p>
+      <w:pPr>
         <w:spacing w:after="120" w:line="300"/>
         <w:jc w:val="both"/>
       </w:pPr>
@@ -42955,7 +43012,7 @@
         <w:drawing>
           <wp:inline xmlns:a="http://schemas.openxmlformats.org/drawingml/2006/main" xmlns:pic="http://schemas.openxmlformats.org/drawingml/2006/picture">
             <wp:extent cx="5580000" cy="3224000"/>
-            <wp:docPr id="5" name="Picture 5"/>
+            <wp:docPr id="6" name="Picture 6"/>
             <wp:cNvGraphicFramePr>
               <a:graphicFrameLocks noChangeAspect="1"/>
             </wp:cNvGraphicFramePr>
@@ -42967,7 +43024,7 @@
                     <pic:cNvPicPr/>
                   </pic:nvPicPr>
                   <pic:blipFill>
-                    <a:blip r:embed="rId31"/>
+                    <a:blip r:embed="rId32"/>
                     <a:stretch>
                       <a:fillRect/>
                     </a:stretch>
@@ -43029,7 +43086,7 @@
         <w:drawing>
           <wp:inline xmlns:a="http://schemas.openxmlformats.org/drawingml/2006/main" xmlns:pic="http://schemas.openxmlformats.org/drawingml/2006/picture">
             <wp:extent cx="5400000" cy="4056087"/>
-            <wp:docPr id="6" name="Picture 6"/>
+            <wp:docPr id="7" name="Picture 7"/>
             <wp:cNvGraphicFramePr>
               <a:graphicFrameLocks noChangeAspect="1"/>
             </wp:cNvGraphicFramePr>
@@ -43041,7 +43098,7 @@
                     <pic:cNvPicPr/>
                   </pic:nvPicPr>
                   <pic:blipFill>
-                    <a:blip r:embed="rId32"/>
+                    <a:blip r:embed="rId33"/>
                     <a:stretch>
                       <a:fillRect/>
                     </a:stretch>
@@ -43292,6 +43349,322 @@
           <w:szCs w:val="24"/>
         </w:rPr>
         <w:t xml:space="preserve"> synthetic data only; the model was trained on a 2013 European dataset and applies to benchmark-feature transactions; notifications are simulated; SQLite instead of PostgreSQL; no TLS; not a payment system and not PCI DSS certified.</w:t>
+      </w:r>
+    </w:p>
+    <w:p>
+      <w:pPr>
+        <w:pStyle w:val="Heading1"/>
+        <w:pageBreakBefore/>
+        <w:spacing w:after="200" w:before="0"/>
+      </w:pPr>
+      <w:r>
+        <w:rPr>
+          <w:rFonts w:ascii="Times New Roman" w:cs="Times New Roman" w:eastAsia="Times New Roman" w:hAnsi="Times New Roman"/>
+          <w:b/>
+          <w:bCs/>
+          <w:sz w:val="30"/>
+          <w:szCs w:val="30"/>
+        </w:rPr>
+        <w:t xml:space="preserve">Appendix B: Screenshots of the Working Demonstrator</w:t>
+      </w:r>
+    </w:p>
+    <w:p>
+      <w:pPr>
+        <w:spacing w:after="80" w:line="300"/>
+        <w:jc w:val="both"/>
+      </w:pPr>
+      <w:r>
+        <w:rPr>
+          <w:rFonts w:ascii="Times New Roman" w:cs="Times New Roman" w:eastAsia="Times New Roman" w:hAnsi="Times New Roman"/>
+          <w:sz w:val="24"/>
+          <w:szCs w:val="24"/>
+        </w:rPr>
+        <w:t xml:space="preserve">Screenshots taken from the running application (synthetic demo data, Chromium at 1440 × 900). The page-by-page set is in docs/screenshots/ in the repository.</w:t>
+      </w:r>
+    </w:p>
+    <w:p>
+      <w:pPr>
+        <w:keepNext/>
+        <w:spacing w:after="80"/>
+        <w:jc w:val="center"/>
+      </w:pPr>
+      <w:r>
+        <w:drawing>
+          <wp:inline xmlns:a="http://schemas.openxmlformats.org/drawingml/2006/main" xmlns:pic="http://schemas.openxmlformats.org/drawingml/2006/picture">
+            <wp:extent cx="5220000" cy="3393000"/>
+            <wp:docPr id="8" name="Picture 8"/>
+            <wp:cNvGraphicFramePr>
+              <a:graphicFrameLocks noChangeAspect="1"/>
+            </wp:cNvGraphicFramePr>
+            <a:graphic>
+              <a:graphicData uri="http://schemas.openxmlformats.org/drawingml/2006/picture">
+                <pic:pic>
+                  <pic:nvPicPr>
+                    <pic:cNvPr id="0" name="02-overview.png"/>
+                    <pic:cNvPicPr/>
+                  </pic:nvPicPr>
+                  <pic:blipFill>
+                    <a:blip r:embed="rId34"/>
+                    <a:stretch>
+                      <a:fillRect/>
+                    </a:stretch>
+                  </pic:blipFill>
+                  <pic:spPr>
+                    <a:xfrm>
+                      <a:off x="0" y="0"/>
+                      <a:ext cx="5220000" cy="3393000"/>
+                    </a:xfrm>
+                    <a:prstGeom prst="rect"/>
+                  </pic:spPr>
+                </pic:pic>
+              </a:graphicData>
+            </a:graphic>
+          </wp:inline>
+        </w:drawing>
+      </w:r>
+    </w:p>
+    <w:p>
+      <w:pPr>
+        <w:spacing w:after="160"/>
+        <w:jc w:val="center"/>
+      </w:pPr>
+      <w:r>
+        <w:rPr>
+          <w:rFonts w:ascii="Times New Roman" w:cs="Times New Roman" w:eastAsia="Times New Roman" w:hAnsi="Times New Roman"/>
+          <w:i/>
+          <w:iCs/>
+          <w:sz w:val="21"/>
+          <w:szCs w:val="21"/>
+        </w:rPr>
+        <w:t xml:space="preserve">Fig. B.1: Overview: volume, decisions, backlog and flagged value in ₹</w:t>
+      </w:r>
+    </w:p>
+    <w:p>
+      <w:pPr>
+        <w:keepNext/>
+        <w:spacing w:after="80"/>
+        <w:jc w:val="center"/>
+      </w:pPr>
+      <w:r>
+        <w:drawing>
+          <wp:inline xmlns:a="http://schemas.openxmlformats.org/drawingml/2006/main" xmlns:pic="http://schemas.openxmlformats.org/drawingml/2006/picture">
+            <wp:extent cx="5220000" cy="3262500"/>
+            <wp:docPr id="9" name="Picture 9"/>
+            <wp:cNvGraphicFramePr>
+              <a:graphicFrameLocks noChangeAspect="1"/>
+            </wp:cNvGraphicFramePr>
+            <a:graphic>
+              <a:graphicData uri="http://schemas.openxmlformats.org/drawingml/2006/picture">
+                <pic:pic>
+                  <pic:nvPicPr>
+                    <pic:cNvPr id="0" name="04-alerts.png"/>
+                    <pic:cNvPicPr/>
+                  </pic:nvPicPr>
+                  <pic:blipFill>
+                    <a:blip r:embed="rId35"/>
+                    <a:stretch>
+                      <a:fillRect/>
+                    </a:stretch>
+                  </pic:blipFill>
+                  <pic:spPr>
+                    <a:xfrm>
+                      <a:off x="0" y="0"/>
+                      <a:ext cx="5220000" cy="3262500"/>
+                    </a:xfrm>
+                    <a:prstGeom prst="rect"/>
+                  </pic:spPr>
+                </pic:pic>
+              </a:graphicData>
+            </a:graphic>
+          </wp:inline>
+        </w:drawing>
+      </w:r>
+    </w:p>
+    <w:p>
+      <w:pPr>
+        <w:spacing w:after="160"/>
+        <w:jc w:val="center"/>
+      </w:pPr>
+      <w:r>
+        <w:rPr>
+          <w:rFonts w:ascii="Times New Roman" w:cs="Times New Roman" w:eastAsia="Times New Roman" w:hAnsi="Times New Roman"/>
+          <w:i/>
+          <w:iCs/>
+          <w:sz w:val="21"/>
+          <w:szCs w:val="21"/>
+        </w:rPr>
+        <w:t xml:space="preserve">Fig. B.2: Alerts and cases: queue ordered by risk, with assignment</w:t>
+      </w:r>
+    </w:p>
+    <w:p>
+      <w:pPr>
+        <w:keepNext/>
+        <w:spacing w:after="80"/>
+        <w:jc w:val="center"/>
+      </w:pPr>
+      <w:r>
+        <w:drawing>
+          <wp:inline xmlns:a="http://schemas.openxmlformats.org/drawingml/2006/main" xmlns:pic="http://schemas.openxmlformats.org/drawingml/2006/picture">
+            <wp:extent cx="5220000" cy="4230375"/>
+            <wp:docPr id="10" name="Picture 10"/>
+            <wp:cNvGraphicFramePr>
+              <a:graphicFrameLocks noChangeAspect="1"/>
+            </wp:cNvGraphicFramePr>
+            <a:graphic>
+              <a:graphicData uri="http://schemas.openxmlformats.org/drawingml/2006/picture">
+                <pic:pic>
+                  <pic:nvPicPr>
+                    <pic:cNvPr id="0" name="12-transaction-detail.png"/>
+                    <pic:cNvPicPr/>
+                  </pic:nvPicPr>
+                  <pic:blipFill>
+                    <a:blip r:embed="rId36"/>
+                    <a:stretch>
+                      <a:fillRect/>
+                    </a:stretch>
+                  </pic:blipFill>
+                  <pic:spPr>
+                    <a:xfrm>
+                      <a:off x="0" y="0"/>
+                      <a:ext cx="5220000" cy="4230375"/>
+                    </a:xfrm>
+                    <a:prstGeom prst="rect"/>
+                  </pic:spPr>
+                </pic:pic>
+              </a:graphicData>
+            </a:graphic>
+          </wp:inline>
+        </w:drawing>
+      </w:r>
+    </w:p>
+    <w:p>
+      <w:pPr>
+        <w:spacing w:after="160"/>
+        <w:jc w:val="center"/>
+      </w:pPr>
+      <w:r>
+        <w:rPr>
+          <w:rFonts w:ascii="Times New Roman" w:cs="Times New Roman" w:eastAsia="Times New Roman" w:hAnsi="Times New Roman"/>
+          <w:i/>
+          <w:iCs/>
+          <w:sz w:val="21"/>
+          <w:szCs w:val="21"/>
+        </w:rPr>
+        <w:t xml:space="preserve">Fig. B.3: Transaction page: score factors, cardholder, history, audit trail and verdict</w:t>
+      </w:r>
+    </w:p>
+    <w:p>
+      <w:pPr>
+        <w:keepNext/>
+        <w:spacing w:after="80"/>
+        <w:jc w:val="center"/>
+      </w:pPr>
+      <w:r>
+        <w:drawing>
+          <wp:inline xmlns:a="http://schemas.openxmlformats.org/drawingml/2006/main" xmlns:pic="http://schemas.openxmlformats.org/drawingml/2006/picture">
+            <wp:extent cx="5220000" cy="3262500"/>
+            <wp:docPr id="11" name="Picture 11"/>
+            <wp:cNvGraphicFramePr>
+              <a:graphicFrameLocks noChangeAspect="1"/>
+            </wp:cNvGraphicFramePr>
+            <a:graphic>
+              <a:graphicData uri="http://schemas.openxmlformats.org/drawingml/2006/picture">
+                <pic:pic>
+                  <pic:nvPicPr>
+                    <pic:cNvPr id="0" name="08-models.png"/>
+                    <pic:cNvPicPr/>
+                  </pic:nvPicPr>
+                  <pic:blipFill>
+                    <a:blip r:embed="rId37"/>
+                    <a:stretch>
+                      <a:fillRect/>
+                    </a:stretch>
+                  </pic:blipFill>
+                  <pic:spPr>
+                    <a:xfrm>
+                      <a:off x="0" y="0"/>
+                      <a:ext cx="5220000" cy="3262500"/>
+                    </a:xfrm>
+                    <a:prstGeom prst="rect"/>
+                  </pic:spPr>
+                </pic:pic>
+              </a:graphicData>
+            </a:graphic>
+          </wp:inline>
+        </w:drawing>
+      </w:r>
+    </w:p>
+    <w:p>
+      <w:pPr>
+        <w:spacing w:after="160"/>
+        <w:jc w:val="center"/>
+      </w:pPr>
+      <w:r>
+        <w:rPr>
+          <w:rFonts w:ascii="Times New Roman" w:cs="Times New Roman" w:eastAsia="Times New Roman" w:hAnsi="Times New Roman"/>
+          <w:i/>
+          <w:iCs/>
+          <w:sz w:val="21"/>
+          <w:szCs w:val="21"/>
+        </w:rPr>
+        <w:t xml:space="preserve">Fig. B.4: ML model page: held-out metrics, data and method, caveats</w:t>
+      </w:r>
+    </w:p>
+    <w:p>
+      <w:pPr>
+        <w:keepNext/>
+        <w:spacing w:after="80"/>
+        <w:jc w:val="center"/>
+      </w:pPr>
+      <w:r>
+        <w:drawing>
+          <wp:inline xmlns:a="http://schemas.openxmlformats.org/drawingml/2006/main" xmlns:pic="http://schemas.openxmlformats.org/drawingml/2006/picture">
+            <wp:extent cx="4500000" cy="5031250"/>
+            <wp:docPr id="12" name="Picture 12"/>
+            <wp:cNvGraphicFramePr>
+              <a:graphicFrameLocks noChangeAspect="1"/>
+            </wp:cNvGraphicFramePr>
+            <a:graphic>
+              <a:graphicData uri="http://schemas.openxmlformats.org/drawingml/2006/picture">
+                <pic:pic>
+                  <pic:nvPicPr>
+                    <pic:cNvPr id="0" name="09-reports.png"/>
+                    <pic:cNvPicPr/>
+                  </pic:nvPicPr>
+                  <pic:blipFill>
+                    <a:blip r:embed="rId38"/>
+                    <a:stretch>
+                      <a:fillRect/>
+                    </a:stretch>
+                  </pic:blipFill>
+                  <pic:spPr>
+                    <a:xfrm>
+                      <a:off x="0" y="0"/>
+                      <a:ext cx="4500000" cy="5031250"/>
+                    </a:xfrm>
+                    <a:prstGeom prst="rect"/>
+                  </pic:spPr>
+                </pic:pic>
+              </a:graphicData>
+            </a:graphic>
+          </wp:inline>
+        </w:drawing>
+      </w:r>
+    </w:p>
+    <w:p>
+      <w:pPr>
+        <w:spacing w:after="160"/>
+        <w:jc w:val="center"/>
+      </w:pPr>
+      <w:r>
+        <w:rPr>
+          <w:rFonts w:ascii="Times New Roman" w:cs="Times New Roman" w:eastAsia="Times New Roman" w:hAnsi="Times New Roman"/>
+          <w:i/>
+          <w:iCs/>
+          <w:sz w:val="21"/>
+          <w:szCs w:val="21"/>
+        </w:rPr>
+        <w:t xml:space="preserve">Fig. B.5: Reports: totals, rates, analyst productivity and daily trend</w:t>
       </w:r>
     </w:p>
     <w:sectPr>

</xml_diff>